<commit_message>
update of 12/06/2026 progress
</commit_message>
<xml_diff>
--- a/AI_Math_tutor_Development.docx
+++ b/AI_Math_tutor_Development.docx
@@ -1775,6 +1775,9 @@
     <w:p/>
     <w:p>
       <w:r>
+        <w:rPr>
+          <w:noProof/>
+        </w:rPr>
         <w:drawing>
           <wp:inline distT="0" distB="0" distL="0" distR="0" wp14:anchorId="300D270E" wp14:editId="69A644CE">
             <wp:extent cx="5943600" cy="3066415"/>
@@ -1800,6 +1803,113 @@
                     <a:xfrm>
                       <a:off x="0" y="0"/>
                       <a:ext cx="5943600" cy="3066415"/>
+                    </a:xfrm>
+                    <a:prstGeom prst="rect">
+                      <a:avLst/>
+                    </a:prstGeom>
+                  </pic:spPr>
+                </pic:pic>
+              </a:graphicData>
+            </a:graphic>
+          </wp:inline>
+        </w:drawing>
+      </w:r>
+    </w:p>
+    <w:p>
+      <w:r>
+        <w:t>12/06/2026</w:t>
+      </w:r>
+    </w:p>
+    <w:p>
+      <w:r>
+        <w:t xml:space="preserve">Today, I connected the whiteboard canvas with backend. But I got error in backend and frontend </w:t>
+      </w:r>
+      <w:proofErr w:type="gramStart"/>
+      <w:r>
+        <w:t>connection .however</w:t>
+      </w:r>
+      <w:proofErr w:type="gramEnd"/>
+      <w:r>
+        <w:t xml:space="preserve">, I can see the greetings on whiteboard because I already declare the output for “hi, how are you, hello” as manually </w:t>
+      </w:r>
+      <w:proofErr w:type="gramStart"/>
+      <w:r>
+        <w:t>like</w:t>
+      </w:r>
+      <w:proofErr w:type="gramEnd"/>
+      <w:r>
+        <w:t xml:space="preserve">” Hi, I am Your AI math tutor”. </w:t>
+      </w:r>
+      <w:proofErr w:type="gramStart"/>
+      <w:r>
+        <w:t>So</w:t>
+      </w:r>
+      <w:proofErr w:type="gramEnd"/>
+      <w:r>
+        <w:t xml:space="preserve"> I can </w:t>
+      </w:r>
+      <w:proofErr w:type="gramStart"/>
+      <w:r>
+        <w:t>see</w:t>
+      </w:r>
+      <w:proofErr w:type="gramEnd"/>
+      <w:r>
+        <w:t xml:space="preserve"> on my Canvas as well. Now next stage </w:t>
+      </w:r>
+      <w:proofErr w:type="gramStart"/>
+      <w:r>
+        <w:t>would</w:t>
+      </w:r>
+      <w:proofErr w:type="gramEnd"/>
+      <w:r>
+        <w:t xml:space="preserve"> be figured out the error between backend and frontend connection, and solve it</w:t>
+      </w:r>
+      <w:r>
+        <w:br/>
+      </w:r>
+    </w:p>
+    <w:p>
+      <w:r>
+        <w:lastRenderedPageBreak/>
+        <w:t xml:space="preserve">This is the </w:t>
+      </w:r>
+      <w:proofErr w:type="spellStart"/>
+      <w:r>
+        <w:t>ouput</w:t>
+      </w:r>
+      <w:proofErr w:type="spellEnd"/>
+      <w:r>
+        <w:t xml:space="preserve"> for today’s progress</w:t>
+      </w:r>
+      <w:r>
+        <w:br/>
+      </w:r>
+      <w:r>
+        <w:drawing>
+          <wp:inline distT="0" distB="0" distL="0" distR="0" wp14:anchorId="7A929C55" wp14:editId="4921744F">
+            <wp:extent cx="4165600" cy="1950177"/>
+            <wp:effectExtent l="0" t="0" r="6350" b="0"/>
+            <wp:docPr id="1264765656" name="Picture 1"/>
+            <wp:cNvGraphicFramePr>
+              <a:graphicFrameLocks xmlns:a="http://schemas.openxmlformats.org/drawingml/2006/main" noChangeAspect="1"/>
+            </wp:cNvGraphicFramePr>
+            <a:graphic xmlns:a="http://schemas.openxmlformats.org/drawingml/2006/main">
+              <a:graphicData uri="http://schemas.openxmlformats.org/drawingml/2006/picture">
+                <pic:pic xmlns:pic="http://schemas.openxmlformats.org/drawingml/2006/picture">
+                  <pic:nvPicPr>
+                    <pic:cNvPr id="1264765656" name=""/>
+                    <pic:cNvPicPr/>
+                  </pic:nvPicPr>
+                  <pic:blipFill>
+                    <a:blip r:embed="rId10"/>
+                    <a:stretch>
+                      <a:fillRect/>
+                    </a:stretch>
+                  </pic:blipFill>
+                  <pic:spPr>
+                    <a:xfrm>
+                      <a:off x="0" y="0"/>
+                      <a:ext cx="4170927" cy="1952671"/>
                     </a:xfrm>
                     <a:prstGeom prst="rect">
                       <a:avLst/>

</xml_diff>